<commit_message>
updated the report document
</commit_message>
<xml_diff>
--- a/Evidence/StateHasChanged.docx
+++ b/Evidence/StateHasChanged.docx
@@ -93,8 +93,19 @@
             <w:sz w:val="22"/>
             <w:szCs w:val="22"/>
           </w:rPr>
-          <w:t>BhaskarSuresh22/StateHasChangedValidation</w:t>
+          <w:t>BhaskarSuresh22/</w:t>
         </w:r>
+        <w:proofErr w:type="spellStart"/>
+        <w:r>
+          <w:rPr>
+            <w:rStyle w:val="Hyperlink"/>
+            <w:rFonts w:ascii="Segoe UI" w:hAnsi="Segoe UI" w:cs="Segoe UI"/>
+            <w:sz w:val="22"/>
+            <w:szCs w:val="22"/>
+          </w:rPr>
+          <w:t>StateHasChangedValidation</w:t>
+        </w:r>
+        <w:proofErr w:type="spellEnd"/>
       </w:hyperlink>
     </w:p>
     <w:p>
@@ -322,15 +333,15 @@
     <w:tbl>
       <w:tblPr>
         <w:tblStyle w:val="PlainTable1"/>
-        <w:tblW w:w="0" w:type="auto"/>
+        <w:tblW w:w="9715" w:type="dxa"/>
         <w:tblLayout w:type="fixed"/>
         <w:tblLook w:val="04A0" w:firstRow="1" w:lastRow="0" w:firstColumn="1" w:lastColumn="0" w:noHBand="0" w:noVBand="1"/>
       </w:tblPr>
       <w:tblGrid>
-        <w:gridCol w:w="665"/>
-        <w:gridCol w:w="4820"/>
+        <w:gridCol w:w="715"/>
+        <w:gridCol w:w="4770"/>
         <w:gridCol w:w="1710"/>
-        <w:gridCol w:w="2155"/>
+        <w:gridCol w:w="2520"/>
       </w:tblGrid>
       <w:tr>
         <w:trPr>
@@ -339,7 +350,7 @@
         <w:tc>
           <w:tcPr>
             <w:cnfStyle w:val="001000000000" w:firstRow="0" w:lastRow="0" w:firstColumn="1" w:lastColumn="0" w:oddVBand="0" w:evenVBand="0" w:oddHBand="0" w:evenHBand="0" w:firstRowFirstColumn="0" w:firstRowLastColumn="0" w:lastRowFirstColumn="0" w:lastRowLastColumn="0"/>
-            <w:tcW w:w="665" w:type="dxa"/>
+            <w:tcW w:w="715" w:type="dxa"/>
             <w:hideMark/>
           </w:tcPr>
           <w:p>
@@ -352,6 +363,7 @@
                 <w:szCs w:val="22"/>
               </w:rPr>
             </w:pPr>
+            <w:proofErr w:type="gramStart"/>
             <w:r>
               <w:rPr>
                 <w:rFonts w:ascii="Segoe UI" w:hAnsi="Segoe UI" w:cs="Segoe UI"/>
@@ -376,11 +388,12 @@
               </w:rPr>
               <w:t>No</w:t>
             </w:r>
+            <w:proofErr w:type="gramEnd"/>
           </w:p>
         </w:tc>
         <w:tc>
           <w:tcPr>
-            <w:tcW w:w="4820" w:type="dxa"/>
+            <w:tcW w:w="4770" w:type="dxa"/>
             <w:hideMark/>
           </w:tcPr>
           <w:p>
@@ -434,7 +447,7 @@
         </w:tc>
         <w:tc>
           <w:tcPr>
-            <w:tcW w:w="2155" w:type="dxa"/>
+            <w:tcW w:w="2520" w:type="dxa"/>
             <w:hideMark/>
           </w:tcPr>
           <w:p>
@@ -466,7 +479,7 @@
         <w:tc>
           <w:tcPr>
             <w:cnfStyle w:val="001000000000" w:firstRow="0" w:lastRow="0" w:firstColumn="1" w:lastColumn="0" w:oddVBand="0" w:evenVBand="0" w:oddHBand="0" w:evenHBand="0" w:firstRowFirstColumn="0" w:firstRowLastColumn="0" w:lastRowFirstColumn="0" w:lastRowLastColumn="0"/>
-            <w:tcW w:w="665" w:type="dxa"/>
+            <w:tcW w:w="715" w:type="dxa"/>
             <w:hideMark/>
           </w:tcPr>
           <w:p>
@@ -490,7 +503,7 @@
         </w:tc>
         <w:tc>
           <w:tcPr>
-            <w:tcW w:w="4820" w:type="dxa"/>
+            <w:tcW w:w="4770" w:type="dxa"/>
             <w:hideMark/>
           </w:tcPr>
           <w:p>
@@ -639,7 +652,7 @@
         </w:tc>
         <w:tc>
           <w:tcPr>
-            <w:tcW w:w="2155" w:type="dxa"/>
+            <w:tcW w:w="2520" w:type="dxa"/>
             <w:hideMark/>
           </w:tcPr>
           <w:p>
@@ -674,6 +687,17 @@
                 <w:szCs w:val="22"/>
               </w:rPr>
             </w:pPr>
+            <w:r>
+              <w:rPr>
+                <w:rFonts w:ascii="Segoe UI" w:hAnsi="Segoe UI" w:cs="Segoe UI"/>
+                <w:sz w:val="22"/>
+                <w:szCs w:val="22"/>
+              </w:rPr>
+              <w:t>Commit -</w:t>
+            </w:r>
+            <w:r>
+              <w:t xml:space="preserve"> </w:t>
+            </w:r>
             <w:hyperlink r:id="rId12" w:history="1">
               <w:r>
                 <w:rPr>
@@ -692,7 +716,7 @@
         <w:tc>
           <w:tcPr>
             <w:cnfStyle w:val="001000000000" w:firstRow="0" w:lastRow="0" w:firstColumn="1" w:lastColumn="0" w:oddVBand="0" w:evenVBand="0" w:oddHBand="0" w:evenHBand="0" w:firstRowFirstColumn="0" w:firstRowLastColumn="0" w:lastRowFirstColumn="0" w:lastRowLastColumn="0"/>
-            <w:tcW w:w="665" w:type="dxa"/>
+            <w:tcW w:w="715" w:type="dxa"/>
             <w:hideMark/>
           </w:tcPr>
           <w:p>
@@ -716,7 +740,7 @@
         </w:tc>
         <w:tc>
           <w:tcPr>
-            <w:tcW w:w="4820" w:type="dxa"/>
+            <w:tcW w:w="4770" w:type="dxa"/>
             <w:hideMark/>
           </w:tcPr>
           <w:p>
@@ -793,7 +817,7 @@
         </w:tc>
         <w:tc>
           <w:tcPr>
-            <w:tcW w:w="2155" w:type="dxa"/>
+            <w:tcW w:w="2520" w:type="dxa"/>
             <w:hideMark/>
           </w:tcPr>
           <w:p>
@@ -827,7 +851,7 @@
         <w:tc>
           <w:tcPr>
             <w:cnfStyle w:val="001000000000" w:firstRow="0" w:lastRow="0" w:firstColumn="1" w:lastColumn="0" w:oddVBand="0" w:evenVBand="0" w:oddHBand="0" w:evenHBand="0" w:firstRowFirstColumn="0" w:firstRowLastColumn="0" w:lastRowFirstColumn="0" w:lastRowLastColumn="0"/>
-            <w:tcW w:w="665" w:type="dxa"/>
+            <w:tcW w:w="715" w:type="dxa"/>
             <w:hideMark/>
           </w:tcPr>
           <w:p>
@@ -845,14 +869,13 @@
                 <w:sz w:val="22"/>
                 <w:szCs w:val="22"/>
               </w:rPr>
-              <w:lastRenderedPageBreak/>
               <w:t>3</w:t>
             </w:r>
           </w:p>
         </w:tc>
         <w:tc>
           <w:tcPr>
-            <w:tcW w:w="4820" w:type="dxa"/>
+            <w:tcW w:w="4770" w:type="dxa"/>
             <w:hideMark/>
           </w:tcPr>
           <w:p>
@@ -911,7 +934,7 @@
         </w:tc>
         <w:tc>
           <w:tcPr>
-            <w:tcW w:w="2155" w:type="dxa"/>
+            <w:tcW w:w="2520" w:type="dxa"/>
             <w:hideMark/>
           </w:tcPr>
           <w:p>
@@ -952,6 +975,7 @@
                 <w:sz w:val="22"/>
                 <w:szCs w:val="22"/>
               </w:rPr>
+              <w:lastRenderedPageBreak/>
               <w:t xml:space="preserve">Commit - </w:t>
             </w:r>
             <w:hyperlink r:id="rId15" w:history="1">
@@ -972,7 +996,7 @@
         <w:tc>
           <w:tcPr>
             <w:cnfStyle w:val="001000000000" w:firstRow="0" w:lastRow="0" w:firstColumn="1" w:lastColumn="0" w:oddVBand="0" w:evenVBand="0" w:oddHBand="0" w:evenHBand="0" w:firstRowFirstColumn="0" w:firstRowLastColumn="0" w:lastRowFirstColumn="0" w:lastRowLastColumn="0"/>
-            <w:tcW w:w="665" w:type="dxa"/>
+            <w:tcW w:w="715" w:type="dxa"/>
             <w:hideMark/>
           </w:tcPr>
           <w:p>
@@ -990,13 +1014,14 @@
                 <w:sz w:val="22"/>
                 <w:szCs w:val="22"/>
               </w:rPr>
+              <w:lastRenderedPageBreak/>
               <w:t>4</w:t>
             </w:r>
           </w:p>
         </w:tc>
         <w:tc>
           <w:tcPr>
-            <w:tcW w:w="4820" w:type="dxa"/>
+            <w:tcW w:w="4770" w:type="dxa"/>
             <w:hideMark/>
           </w:tcPr>
           <w:p>
@@ -1016,7 +1041,27 @@
                 <w:szCs w:val="22"/>
                 <w:lang w:val="en-IN"/>
               </w:rPr>
-              <w:t>After applying every offered fix, the UI continues to update everywhere as it did before applying the fixes.</w:t>
+              <w:t xml:space="preserve">After applying every offered fix, the UI continues to update everywhere as it did before </w:t>
+            </w:r>
+            <w:proofErr w:type="gramStart"/>
+            <w:r>
+              <w:rPr>
+                <w:rFonts w:ascii="Segoe UI" w:hAnsi="Segoe UI" w:cs="Segoe UI"/>
+                <w:sz w:val="22"/>
+                <w:szCs w:val="22"/>
+                <w:lang w:val="en-IN"/>
+              </w:rPr>
+              <w:t>applying</w:t>
+            </w:r>
+            <w:proofErr w:type="gramEnd"/>
+            <w:r>
+              <w:rPr>
+                <w:rFonts w:ascii="Segoe UI" w:hAnsi="Segoe UI" w:cs="Segoe UI"/>
+                <w:sz w:val="22"/>
+                <w:szCs w:val="22"/>
+                <w:lang w:val="en-IN"/>
+              </w:rPr>
+              <w:t xml:space="preserve"> the fixes.</w:t>
             </w:r>
           </w:p>
         </w:tc>
@@ -1055,7 +1100,7 @@
         </w:tc>
         <w:tc>
           <w:tcPr>
-            <w:tcW w:w="2155" w:type="dxa"/>
+            <w:tcW w:w="2520" w:type="dxa"/>
             <w:hideMark/>
           </w:tcPr>
           <w:p>
@@ -1111,7 +1156,7 @@
         <w:tc>
           <w:tcPr>
             <w:cnfStyle w:val="001000000000" w:firstRow="0" w:lastRow="0" w:firstColumn="1" w:lastColumn="0" w:oddVBand="0" w:evenVBand="0" w:oddHBand="0" w:evenHBand="0" w:firstRowFirstColumn="0" w:firstRowLastColumn="0" w:lastRowFirstColumn="0" w:lastRowLastColumn="0"/>
-            <w:tcW w:w="665" w:type="dxa"/>
+            <w:tcW w:w="715" w:type="dxa"/>
           </w:tcPr>
           <w:p>
             <w:pPr>
@@ -1133,7 +1178,7 @@
         </w:tc>
         <w:tc>
           <w:tcPr>
-            <w:tcW w:w="4820" w:type="dxa"/>
+            <w:tcW w:w="4770" w:type="dxa"/>
           </w:tcPr>
           <w:p>
             <w:pPr>
@@ -1192,7 +1237,7 @@
         </w:tc>
         <w:tc>
           <w:tcPr>
-            <w:tcW w:w="2155" w:type="dxa"/>
+            <w:tcW w:w="2520" w:type="dxa"/>
           </w:tcPr>
           <w:p>
             <w:pPr>
@@ -1221,7 +1266,7 @@
         <w:tc>
           <w:tcPr>
             <w:cnfStyle w:val="001000000000" w:firstRow="0" w:lastRow="0" w:firstColumn="1" w:lastColumn="0" w:oddVBand="0" w:evenVBand="0" w:oddHBand="0" w:evenHBand="0" w:firstRowFirstColumn="0" w:firstRowLastColumn="0" w:lastRowFirstColumn="0" w:lastRowLastColumn="0"/>
-            <w:tcW w:w="665" w:type="dxa"/>
+            <w:tcW w:w="715" w:type="dxa"/>
             <w:hideMark/>
           </w:tcPr>
           <w:p>
@@ -1245,7 +1290,7 @@
         </w:tc>
         <w:tc>
           <w:tcPr>
-            <w:tcW w:w="4820" w:type="dxa"/>
+            <w:tcW w:w="4770" w:type="dxa"/>
             <w:hideMark/>
           </w:tcPr>
           <w:p>
@@ -1363,7 +1408,7 @@
         </w:tc>
         <w:tc>
           <w:tcPr>
-            <w:tcW w:w="2155" w:type="dxa"/>
+            <w:tcW w:w="2520" w:type="dxa"/>
             <w:hideMark/>
           </w:tcPr>
           <w:p>
@@ -1414,7 +1459,27 @@
                   <w:sz w:val="22"/>
                   <w:szCs w:val="22"/>
                 </w:rPr>
-                <w:t>moving-call-after-final-await-produces-BL0012</w:t>
+                <w:t>moving-call-after-final-await-</w:t>
+              </w:r>
+              <w:proofErr w:type="gramStart"/>
+              <w:r>
+                <w:rPr>
+                  <w:rStyle w:val="Hyperlink"/>
+                  <w:rFonts w:ascii="Segoe UI" w:hAnsi="Segoe UI" w:cs="Segoe UI"/>
+                  <w:sz w:val="22"/>
+                  <w:szCs w:val="22"/>
+                </w:rPr>
+                <w:t>produces</w:t>
+              </w:r>
+              <w:proofErr w:type="gramEnd"/>
+              <w:r>
+                <w:rPr>
+                  <w:rStyle w:val="Hyperlink"/>
+                  <w:rFonts w:ascii="Segoe UI" w:hAnsi="Segoe UI" w:cs="Segoe UI"/>
+                  <w:sz w:val="22"/>
+                  <w:szCs w:val="22"/>
+                </w:rPr>
+                <w:t>-BL0012</w:t>
               </w:r>
             </w:hyperlink>
           </w:p>
@@ -1427,7 +1492,7 @@
         <w:tc>
           <w:tcPr>
             <w:cnfStyle w:val="001000000000" w:firstRow="0" w:lastRow="0" w:firstColumn="1" w:lastColumn="0" w:oddVBand="0" w:evenVBand="0" w:oddHBand="0" w:evenHBand="0" w:firstRowFirstColumn="0" w:firstRowLastColumn="0" w:lastRowFirstColumn="0" w:lastRowLastColumn="0"/>
-            <w:tcW w:w="665" w:type="dxa"/>
+            <w:tcW w:w="715" w:type="dxa"/>
             <w:hideMark/>
           </w:tcPr>
           <w:p>
@@ -1451,7 +1516,7 @@
         </w:tc>
         <w:tc>
           <w:tcPr>
-            <w:tcW w:w="4820" w:type="dxa"/>
+            <w:tcW w:w="4770" w:type="dxa"/>
             <w:hideMark/>
           </w:tcPr>
           <w:p>
@@ -1541,7 +1606,7 @@
         </w:tc>
         <w:tc>
           <w:tcPr>
-            <w:tcW w:w="2155" w:type="dxa"/>
+            <w:tcW w:w="2520" w:type="dxa"/>
             <w:hideMark/>
           </w:tcPr>
           <w:p>
@@ -1611,208 +1676,6 @@
         </w:rPr>
         <w:t>------</w:t>
       </w:r>
-    </w:p>
-    <w:p>
-      <w:pPr>
-        <w:rPr>
-          <w:rFonts w:ascii="Segoe UI" w:hAnsi="Segoe UI" w:cs="Segoe UI"/>
-          <w:sz w:val="22"/>
-          <w:szCs w:val="22"/>
-        </w:rPr>
-      </w:pPr>
-    </w:p>
-    <w:p>
-      <w:pPr>
-        <w:rPr>
-          <w:rFonts w:ascii="Segoe UI" w:hAnsi="Segoe UI" w:cs="Segoe UI"/>
-          <w:sz w:val="22"/>
-          <w:szCs w:val="22"/>
-          <w:lang w:val="en-IN"/>
-        </w:rPr>
-      </w:pPr>
-      <w:r>
-        <w:rPr>
-          <w:rFonts w:ascii="Segoe UI" w:hAnsi="Segoe UI" w:cs="Segoe UI"/>
-          <w:b/>
-          <w:bCs/>
-          <w:sz w:val="22"/>
-          <w:szCs w:val="22"/>
-          <w:u w:val="single"/>
-        </w:rPr>
-        <w:t>Problems:</w:t>
-      </w:r>
-      <w:r>
-        <w:rPr>
-          <w:rFonts w:ascii="Segoe UI" w:hAnsi="Segoe UI" w:cs="Segoe UI"/>
-          <w:sz w:val="22"/>
-          <w:szCs w:val="22"/>
-          <w:lang w:val="en-IN"/>
-        </w:rPr>
-        <w:t> </w:t>
-      </w:r>
-    </w:p>
-    <w:p>
-      <w:pPr>
-        <w:numPr>
-          <w:ilvl w:val="0"/>
-          <w:numId w:val="12"/>
-        </w:numPr>
-        <w:rPr>
-          <w:rFonts w:ascii="Segoe UI" w:hAnsi="Segoe UI" w:cs="Segoe UI"/>
-          <w:sz w:val="22"/>
-          <w:szCs w:val="22"/>
-          <w:lang w:val="en-IN"/>
-        </w:rPr>
-      </w:pPr>
-      <w:r>
-        <w:rPr>
-          <w:rFonts w:ascii="Segoe UI" w:hAnsi="Segoe UI" w:cs="Segoe UI"/>
-          <w:sz w:val="22"/>
-          <w:szCs w:val="22"/>
-        </w:rPr>
-        <w:t>Regarding the Setup where it was mentioned to apply the Code fix, w</w:t>
-      </w:r>
-      <w:r>
-        <w:rPr>
-          <w:rFonts w:ascii="Segoe UI" w:hAnsi="Segoe UI" w:cs="Segoe UI"/>
-          <w:sz w:val="22"/>
-          <w:szCs w:val="22"/>
-          <w:lang w:val="en-IN"/>
-        </w:rPr>
-        <w:t>hen I hover over the warning, it shows a suggestion to remove the unnecessary call.  </w:t>
-      </w:r>
-    </w:p>
-    <w:p>
-      <w:pPr>
-        <w:rPr>
-          <w:rFonts w:ascii="Segoe UI" w:hAnsi="Segoe UI" w:cs="Segoe UI"/>
-          <w:sz w:val="22"/>
-          <w:szCs w:val="22"/>
-          <w:lang w:val="en-IN"/>
-        </w:rPr>
-      </w:pPr>
-      <w:r>
-        <w:rPr>
-          <w:rFonts w:ascii="Segoe UI" w:hAnsi="Segoe UI" w:cs="Segoe UI"/>
-          <w:sz w:val="22"/>
-          <w:szCs w:val="22"/>
-          <w:lang w:val="en-IN"/>
-        </w:rPr>
-        <w:lastRenderedPageBreak/>
-        <w:drawing>
-          <wp:inline distT="0" distB="0" distL="0" distR="0" wp14:anchorId="7272D663" wp14:editId="768D4E82">
-            <wp:extent cx="5943600" cy="1276350"/>
-            <wp:effectExtent l="0" t="0" r="0" b="0"/>
-            <wp:docPr id="1904498045" name="Picture 2"/>
-            <wp:cNvGraphicFramePr>
-              <a:graphicFrameLocks xmlns:a="http://schemas.openxmlformats.org/drawingml/2006/main" noChangeAspect="1"/>
-            </wp:cNvGraphicFramePr>
-            <a:graphic xmlns:a="http://schemas.openxmlformats.org/drawingml/2006/main">
-              <a:graphicData uri="http://schemas.openxmlformats.org/drawingml/2006/picture">
-                <pic:pic xmlns:pic="http://schemas.openxmlformats.org/drawingml/2006/picture">
-                  <pic:nvPicPr>
-                    <pic:cNvPr id="0" name="Picture 6"/>
-                    <pic:cNvPicPr>
-                      <a:picLocks noChangeAspect="1" noChangeArrowheads="1"/>
-                    </pic:cNvPicPr>
-                  </pic:nvPicPr>
-                  <pic:blipFill>
-                    <a:blip r:embed="rId22">
-                      <a:extLst>
-                        <a:ext uri="{28A0092B-C50C-407E-A947-70E740481C1C}">
-                          <a14:useLocalDpi xmlns:a14="http://schemas.microsoft.com/office/drawing/2010/main" val="0"/>
-                        </a:ext>
-                      </a:extLst>
-                    </a:blip>
-                    <a:srcRect/>
-                    <a:stretch>
-                      <a:fillRect/>
-                    </a:stretch>
-                  </pic:blipFill>
-                  <pic:spPr bwMode="auto">
-                    <a:xfrm>
-                      <a:off x="0" y="0"/>
-                      <a:ext cx="5943600" cy="1276350"/>
-                    </a:xfrm>
-                    <a:prstGeom prst="rect">
-                      <a:avLst/>
-                    </a:prstGeom>
-                    <a:noFill/>
-                    <a:ln>
-                      <a:noFill/>
-                    </a:ln>
-                  </pic:spPr>
-                </pic:pic>
-              </a:graphicData>
-            </a:graphic>
-          </wp:inline>
-        </w:drawing>
-      </w:r>
-      <w:r>
-        <w:rPr>
-          <w:rFonts w:ascii="Segoe UI" w:hAnsi="Segoe UI" w:cs="Segoe UI"/>
-          <w:sz w:val="22"/>
-          <w:szCs w:val="22"/>
-          <w:lang w:val="en-IN"/>
-        </w:rPr>
-        <w:t> </w:t>
-      </w:r>
-    </w:p>
-    <w:p>
-      <w:pPr>
-        <w:numPr>
-          <w:ilvl w:val="0"/>
-          <w:numId w:val="13"/>
-        </w:numPr>
-        <w:rPr>
-          <w:rFonts w:ascii="Segoe UI" w:hAnsi="Segoe UI" w:cs="Segoe UI"/>
-          <w:sz w:val="22"/>
-          <w:szCs w:val="22"/>
-          <w:lang w:val="en-IN"/>
-        </w:rPr>
-      </w:pPr>
-      <w:r>
-        <w:rPr>
-          <w:rFonts w:ascii="Segoe UI" w:hAnsi="Segoe UI" w:cs="Segoe UI"/>
-          <w:sz w:val="22"/>
-          <w:szCs w:val="22"/>
-          <w:lang w:val="en-IN"/>
-        </w:rPr>
-        <w:t>However, I’m unable to fix this using IntelliSense’s Fix or Quick Fix option and must remove the call manually.</w:t>
-      </w:r>
-    </w:p>
-    <w:p>
-      <w:pPr>
-        <w:numPr>
-          <w:ilvl w:val="0"/>
-          <w:numId w:val="13"/>
-        </w:numPr>
-        <w:rPr>
-          <w:rFonts w:ascii="Segoe UI" w:hAnsi="Segoe UI" w:cs="Segoe UI"/>
-          <w:sz w:val="22"/>
-          <w:szCs w:val="22"/>
-          <w:lang w:val="en-IN"/>
-        </w:rPr>
-      </w:pPr>
-      <w:r>
-        <w:rPr>
-          <w:rFonts w:ascii="Segoe UI" w:hAnsi="Segoe UI" w:cs="Segoe UI"/>
-          <w:sz w:val="22"/>
-          <w:szCs w:val="22"/>
-          <w:lang w:val="en-IN"/>
-        </w:rPr>
-        <w:t>The Fix and Quick Fix options works fine if I have cleared the bin and obj folders and open the sample in Visual Studio Code again.</w:t>
-      </w:r>
-    </w:p>
-    <w:p>
-      <w:pPr>
-        <w:rPr>
-          <w:rFonts w:ascii="Segoe UI" w:hAnsi="Segoe UI" w:cs="Segoe UI"/>
-          <w:sz w:val="22"/>
-          <w:szCs w:val="22"/>
-          <w:lang w:val="en-IN"/>
-        </w:rPr>
-      </w:pPr>
     </w:p>
     <w:sectPr>
       <w:pgSz w:w="12240" w:h="15840"/>
@@ -3936,6 +3799,7 @@
   <w:style w:type="character" w:default="1" w:styleId="DefaultParagraphFont">
     <w:name w:val="Default Paragraph Font"/>
     <w:uiPriority w:val="1"/>
+    <w:semiHidden/>
     <w:unhideWhenUsed/>
   </w:style>
   <w:style w:type="table" w:default="1" w:styleId="TableNormal">
@@ -4877,6 +4741,10 @@
 </file>
 
 <file path=customXml/item1.xml><?xml version="1.0" encoding="utf-8"?>
+<b:Sources xmlns:b="http://schemas.openxmlformats.org/officeDocument/2006/bibliography" xmlns="http://schemas.openxmlformats.org/officeDocument/2006/bibliography" SelectedStyle="\APASixthEditionOfficeOnline.xsl" StyleName="APA" Version="6"/>
+</file>
+
+<file path=customXml/item2.xml><?xml version="1.0" encoding="utf-8"?>
 <ct:contentTypeSchema xmlns:ct="http://schemas.microsoft.com/office/2006/metadata/contentType" xmlns:ma="http://schemas.microsoft.com/office/2006/metadata/properties/metaAttributes" ct:_="" ma:_="" ma:contentTypeName="Document" ma:contentTypeID="0x0101002A361625FF487C4CA3EA5191E57B8C6D" ma:contentTypeVersion="7" ma:contentTypeDescription="Create a new document." ma:contentTypeScope="" ma:versionID="0eb70986208f3b9782e223574112875e">
   <xsd:schema xmlns:xsd="http://www.w3.org/2001/XMLSchema" xmlns:xs="http://www.w3.org/2001/XMLSchema" xmlns:p="http://schemas.microsoft.com/office/2006/metadata/properties" xmlns:ns2="caee7eb6-6dd4-45c1-9e8a-babddf390f35" targetNamespace="http://schemas.microsoft.com/office/2006/metadata/properties" ma:root="true" ma:fieldsID="c0a23b2e9e369a39959eaa3f9d93fb8c" ns2:_="">
     <xsd:import namespace="caee7eb6-6dd4-45c1-9e8a-babddf390f35"/>
@@ -5038,11 +4906,13 @@
 </ct:contentTypeSchema>
 </file>
 
-<file path=customXml/item2.xml><?xml version="1.0" encoding="utf-8"?>
-<b:Sources xmlns:b="http://schemas.openxmlformats.org/officeDocument/2006/bibliography" xmlns="http://schemas.openxmlformats.org/officeDocument/2006/bibliography" SelectedStyle="\APASixthEditionOfficeOnline.xsl" StyleName="APA" Version="6"/>
+<file path=customXml/item3.xml><?xml version="1.0" encoding="utf-8"?>
+<p:properties xmlns:p="http://schemas.microsoft.com/office/2006/metadata/properties" xmlns:xsi="http://www.w3.org/2001/XMLSchema-instance" xmlns:pc="http://schemas.microsoft.com/office/infopath/2007/PartnerControls">
+  <documentManagement/>
+</p:properties>
 </file>
 
-<file path=customXml/item3.xml><?xml version="1.0" encoding="utf-8"?>
+<file path=customXml/item4.xml><?xml version="1.0" encoding="utf-8"?>
 <?mso-contentType ?>
 <FormTemplates xmlns="http://schemas.microsoft.com/sharepoint/v3/contenttype/forms">
   <Display>DocumentLibraryForm</Display>
@@ -5051,13 +4921,15 @@
 </FormTemplates>
 </file>
 
-<file path=customXml/item4.xml><?xml version="1.0" encoding="utf-8"?>
-<p:properties xmlns:p="http://schemas.microsoft.com/office/2006/metadata/properties" xmlns:xsi="http://www.w3.org/2001/XMLSchema-instance" xmlns:pc="http://schemas.microsoft.com/office/infopath/2007/PartnerControls">
-  <documentManagement/>
-</p:properties>
+<file path=customXml/itemProps1.xml><?xml version="1.0" encoding="utf-8"?>
+<ds:datastoreItem xmlns:ds="http://schemas.openxmlformats.org/officeDocument/2006/customXml" ds:itemID="{5AAC773B-6D45-4B55-959C-3E5686415B21}">
+  <ds:schemaRefs>
+    <ds:schemaRef ds:uri="http://schemas.openxmlformats.org/officeDocument/2006/bibliography"/>
+  </ds:schemaRefs>
+</ds:datastoreItem>
 </file>
 
-<file path=customXml/itemProps1.xml><?xml version="1.0" encoding="utf-8"?>
+<file path=customXml/itemProps2.xml><?xml version="1.0" encoding="utf-8"?>
 <ds:datastoreItem xmlns:ds="http://schemas.openxmlformats.org/officeDocument/2006/customXml" ds:itemID="{E3968AD7-1EAE-4527-A6B8-19B4121ADDD4}">
   <ds:schemaRefs>
     <ds:schemaRef ds:uri="http://schemas.microsoft.com/office/2006/metadata/contentType"/>
@@ -5075,27 +4947,19 @@
 </ds:datastoreItem>
 </file>
 
-<file path=customXml/itemProps2.xml><?xml version="1.0" encoding="utf-8"?>
-<ds:datastoreItem xmlns:ds="http://schemas.openxmlformats.org/officeDocument/2006/customXml" ds:itemID="{5AAC773B-6D45-4B55-959C-3E5686415B21}">
-  <ds:schemaRefs>
-    <ds:schemaRef ds:uri="http://schemas.openxmlformats.org/officeDocument/2006/bibliography"/>
-  </ds:schemaRefs>
-</ds:datastoreItem>
-</file>
-
 <file path=customXml/itemProps3.xml><?xml version="1.0" encoding="utf-8"?>
-<ds:datastoreItem xmlns:ds="http://schemas.openxmlformats.org/officeDocument/2006/customXml" ds:itemID="{3F631790-D3F3-4E18-B711-06B94DCBA81C}">
-  <ds:schemaRefs>
-    <ds:schemaRef ds:uri="http://schemas.microsoft.com/sharepoint/v3/contenttype/forms"/>
-  </ds:schemaRefs>
-</ds:datastoreItem>
-</file>
-
-<file path=customXml/itemProps4.xml><?xml version="1.0" encoding="utf-8"?>
 <ds:datastoreItem xmlns:ds="http://schemas.openxmlformats.org/officeDocument/2006/customXml" ds:itemID="{81546901-06A0-43C6-9CC9-9364E0B77FA2}">
   <ds:schemaRefs>
     <ds:schemaRef ds:uri="http://schemas.microsoft.com/office/2006/metadata/properties"/>
     <ds:schemaRef ds:uri="http://schemas.microsoft.com/office/infopath/2007/PartnerControls"/>
   </ds:schemaRefs>
 </ds:datastoreItem>
+</file>
+
+<file path=customXml/itemProps4.xml><?xml version="1.0" encoding="utf-8"?>
+<ds:datastoreItem xmlns:ds="http://schemas.openxmlformats.org/officeDocument/2006/customXml" ds:itemID="{3F631790-D3F3-4E18-B711-06B94DCBA81C}">
+  <ds:schemaRefs>
+    <ds:schemaRef ds:uri="http://schemas.microsoft.com/sharepoint/v3/contenttype/forms"/>
+  </ds:schemaRefs>
+</ds:datastoreItem>
 </file>
</xml_diff>

<commit_message>
updated readme and report document
</commit_message>
<xml_diff>
--- a/Evidence/StateHasChanged.docx
+++ b/Evidence/StateHasChanged.docx
@@ -57,7 +57,7 @@
         </w:rPr>
         <w:t xml:space="preserve">Issue: </w:t>
       </w:r>
-      <w:hyperlink r:id="rId9" w:history="1">
+      <w:hyperlink r:id="rId11" w:history="1">
         <w:r>
           <w:rPr>
             <w:rStyle w:val="Hyperlink"/>
@@ -85,7 +85,7 @@
         </w:rPr>
         <w:t xml:space="preserve">Sample repo: </w:t>
       </w:r>
-      <w:hyperlink r:id="rId10" w:history="1">
+      <w:hyperlink r:id="rId12" w:history="1">
         <w:r>
           <w:rPr>
             <w:rStyle w:val="Hyperlink"/>
@@ -93,19 +93,8 @@
             <w:sz w:val="22"/>
             <w:szCs w:val="22"/>
           </w:rPr>
-          <w:t>BhaskarSuresh22/</w:t>
+          <w:t>BhaskarSuresh22/StateHasChangedValidation</w:t>
         </w:r>
-        <w:proofErr w:type="spellStart"/>
-        <w:r>
-          <w:rPr>
-            <w:rStyle w:val="Hyperlink"/>
-            <w:rFonts w:ascii="Segoe UI" w:hAnsi="Segoe UI" w:cs="Segoe UI"/>
-            <w:sz w:val="22"/>
-            <w:szCs w:val="22"/>
-          </w:rPr>
-          <w:t>StateHasChangedValidation</w:t>
-        </w:r>
-        <w:proofErr w:type="spellEnd"/>
       </w:hyperlink>
     </w:p>
     <w:p>
@@ -188,6 +177,34 @@
           <w:sz w:val="22"/>
           <w:szCs w:val="22"/>
         </w:rPr>
+        <w:t xml:space="preserve">Result: </w:t>
+      </w:r>
+      <w:r>
+        <w:rPr>
+          <w:rFonts w:ascii="Segoe UI" w:hAnsi="Segoe UI" w:cs="Segoe UI"/>
+          <w:b/>
+          <w:bCs/>
+          <w:color w:val="8DD873" w:themeColor="accent6" w:themeTint="99"/>
+          <w:sz w:val="22"/>
+          <w:szCs w:val="22"/>
+        </w:rPr>
+        <w:t>Working Fine</w:t>
+      </w:r>
+    </w:p>
+    <w:p>
+      <w:pPr>
+        <w:rPr>
+          <w:rFonts w:ascii="Segoe UI" w:hAnsi="Segoe UI" w:cs="Segoe UI"/>
+          <w:sz w:val="22"/>
+          <w:szCs w:val="22"/>
+        </w:rPr>
+      </w:pPr>
+      <w:r>
+        <w:rPr>
+          <w:rFonts w:ascii="Segoe UI" w:hAnsi="Segoe UI" w:cs="Segoe UI"/>
+          <w:sz w:val="22"/>
+          <w:szCs w:val="22"/>
+        </w:rPr>
         <w:t>--------------</w:t>
       </w:r>
       <w:r>
@@ -333,15 +350,16 @@
     <w:tbl>
       <w:tblPr>
         <w:tblStyle w:val="PlainTable1"/>
-        <w:tblW w:w="9715" w:type="dxa"/>
+        <w:tblW w:w="10260" w:type="dxa"/>
+        <w:tblInd w:w="-545" w:type="dxa"/>
         <w:tblLayout w:type="fixed"/>
         <w:tblLook w:val="04A0" w:firstRow="1" w:lastRow="0" w:firstColumn="1" w:lastColumn="0" w:noHBand="0" w:noVBand="1"/>
       </w:tblPr>
       <w:tblGrid>
-        <w:gridCol w:w="715"/>
+        <w:gridCol w:w="810"/>
         <w:gridCol w:w="4770"/>
-        <w:gridCol w:w="1710"/>
-        <w:gridCol w:w="2520"/>
+        <w:gridCol w:w="1890"/>
+        <w:gridCol w:w="2790"/>
       </w:tblGrid>
       <w:tr>
         <w:trPr>
@@ -350,7 +368,7 @@
         <w:tc>
           <w:tcPr>
             <w:cnfStyle w:val="001000000000" w:firstRow="0" w:lastRow="0" w:firstColumn="1" w:lastColumn="0" w:oddVBand="0" w:evenVBand="0" w:oddHBand="0" w:evenHBand="0" w:firstRowFirstColumn="0" w:firstRowLastColumn="0" w:lastRowFirstColumn="0" w:lastRowLastColumn="0"/>
-            <w:tcW w:w="715" w:type="dxa"/>
+            <w:tcW w:w="810" w:type="dxa"/>
             <w:hideMark/>
           </w:tcPr>
           <w:p>
@@ -421,7 +439,7 @@
         </w:tc>
         <w:tc>
           <w:tcPr>
-            <w:tcW w:w="1710" w:type="dxa"/>
+            <w:tcW w:w="1890" w:type="dxa"/>
             <w:hideMark/>
           </w:tcPr>
           <w:p>
@@ -447,7 +465,7 @@
         </w:tc>
         <w:tc>
           <w:tcPr>
-            <w:tcW w:w="2520" w:type="dxa"/>
+            <w:tcW w:w="2790" w:type="dxa"/>
             <w:hideMark/>
           </w:tcPr>
           <w:p>
@@ -479,7 +497,7 @@
         <w:tc>
           <w:tcPr>
             <w:cnfStyle w:val="001000000000" w:firstRow="0" w:lastRow="0" w:firstColumn="1" w:lastColumn="0" w:oddVBand="0" w:evenVBand="0" w:oddHBand="0" w:evenHBand="0" w:firstRowFirstColumn="0" w:firstRowLastColumn="0" w:lastRowFirstColumn="0" w:lastRowLastColumn="0"/>
-            <w:tcW w:w="715" w:type="dxa"/>
+            <w:tcW w:w="810" w:type="dxa"/>
             <w:hideMark/>
           </w:tcPr>
           <w:p>
@@ -619,7 +637,7 @@
         </w:tc>
         <w:tc>
           <w:tcPr>
-            <w:tcW w:w="1710" w:type="dxa"/>
+            <w:tcW w:w="1890" w:type="dxa"/>
             <w:hideMark/>
           </w:tcPr>
           <w:p>
@@ -652,7 +670,7 @@
         </w:tc>
         <w:tc>
           <w:tcPr>
-            <w:tcW w:w="2520" w:type="dxa"/>
+            <w:tcW w:w="2790" w:type="dxa"/>
             <w:hideMark/>
           </w:tcPr>
           <w:p>
@@ -665,7 +683,7 @@
                 <w:szCs w:val="22"/>
               </w:rPr>
             </w:pPr>
-            <w:hyperlink r:id="rId11" w:history="1">
+            <w:hyperlink r:id="rId13" w:history="1">
               <w:r>
                 <w:rPr>
                   <w:rStyle w:val="Hyperlink"/>
@@ -679,10 +697,10 @@
           </w:p>
           <w:p>
             <w:pPr>
-              <w:spacing w:after="160" w:line="278" w:lineRule="auto"/>
+              <w:spacing w:after="160"/>
               <w:cnfStyle w:val="000000100000" w:firstRow="0" w:lastRow="0" w:firstColumn="0" w:lastColumn="0" w:oddVBand="0" w:evenVBand="0" w:oddHBand="1" w:evenHBand="0" w:firstRowFirstColumn="0" w:firstRowLastColumn="0" w:lastRowFirstColumn="0" w:lastRowLastColumn="0"/>
               <w:rPr>
-                <w:rFonts w:ascii="Segoe UI" w:hAnsi="Segoe UI" w:cs="Segoe UI"/>
+                <w:rFonts w:asciiTheme="majorHAnsi" w:hAnsiTheme="majorHAnsi" w:cs="Segoe UI"/>
                 <w:sz w:val="22"/>
                 <w:szCs w:val="22"/>
               </w:rPr>
@@ -693,12 +711,76 @@
                 <w:sz w:val="22"/>
                 <w:szCs w:val="22"/>
               </w:rPr>
-              <w:t>Commit -</w:t>
+              <w:t>Commit</w:t>
+            </w:r>
+            <w:r>
+              <w:rPr>
+                <w:rFonts w:ascii="Segoe UI" w:hAnsi="Segoe UI" w:cs="Segoe UI"/>
+                <w:sz w:val="22"/>
+                <w:szCs w:val="22"/>
+              </w:rPr>
+              <w:t>:</w:t>
             </w:r>
             <w:r>
               <w:t xml:space="preserve"> </w:t>
             </w:r>
-            <w:hyperlink r:id="rId12" w:history="1">
+            <w:hyperlink r:id="rId14" w:history="1">
+              <w:r>
+                <w:rPr>
+                  <w:rStyle w:val="Hyperlink"/>
+                  <w:rFonts w:asciiTheme="majorHAnsi" w:hAnsiTheme="majorHAnsi" w:cs="Segoe UI"/>
+                  <w:sz w:val="22"/>
+                  <w:szCs w:val="22"/>
+                </w:rPr>
+                <w:t>unncessary-warnings-BL0012-warnings</w:t>
+              </w:r>
+              <w:r>
+                <w:rPr>
+                  <w:rStyle w:val="Hyperlink"/>
+                  <w:rFonts w:asciiTheme="majorHAnsi" w:hAnsiTheme="majorHAnsi" w:cs="Segoe UI"/>
+                  <w:sz w:val="22"/>
+                  <w:szCs w:val="22"/>
+                </w:rPr>
+                <w:t xml:space="preserve"> </w:t>
+              </w:r>
+              <w:r>
+                <w:rPr>
+                  <w:rStyle w:val="Hyperlink"/>
+                  <w:rFonts w:asciiTheme="majorHAnsi" w:hAnsiTheme="majorHAnsi" w:cs="Segoe UI"/>
+                  <w:b/>
+                  <w:bCs/>
+                  <w:sz w:val="22"/>
+                  <w:szCs w:val="22"/>
+                  <w:lang w:val="en-IN"/>
+                </w:rPr>
+                <w:t>650c89b</w:t>
+              </w:r>
+            </w:hyperlink>
+            <w:r>
+              <w:rPr>
+                <w:rFonts w:asciiTheme="majorHAnsi" w:hAnsiTheme="majorHAnsi" w:cs="Segoe UI"/>
+                <w:sz w:val="22"/>
+                <w:szCs w:val="22"/>
+              </w:rPr>
+              <w:br/>
+            </w:r>
+            <w:r>
+              <w:rPr>
+                <w:rFonts w:asciiTheme="majorHAnsi" w:hAnsiTheme="majorHAnsi" w:cs="Segoe UI"/>
+                <w:sz w:val="22"/>
+                <w:szCs w:val="22"/>
+              </w:rPr>
+              <w:br/>
+            </w:r>
+            <w:r>
+              <w:rPr>
+                <w:rFonts w:ascii="Segoe UI" w:hAnsi="Segoe UI" w:cs="Segoe UI"/>
+                <w:sz w:val="22"/>
+                <w:szCs w:val="22"/>
+              </w:rPr>
+              <w:t xml:space="preserve">Build Logs: </w:t>
+            </w:r>
+            <w:hyperlink r:id="rId15" w:history="1">
               <w:r>
                 <w:rPr>
                   <w:rStyle w:val="Hyperlink"/>
@@ -706,7 +788,7 @@
                   <w:sz w:val="22"/>
                   <w:szCs w:val="22"/>
                 </w:rPr>
-                <w:t>unncessary-warnings-BL0012-warnings</w:t>
+                <w:t>650c89b-unnecessary-warnings.txt</w:t>
               </w:r>
             </w:hyperlink>
           </w:p>
@@ -716,7 +798,7 @@
         <w:tc>
           <w:tcPr>
             <w:cnfStyle w:val="001000000000" w:firstRow="0" w:lastRow="0" w:firstColumn="1" w:lastColumn="0" w:oddVBand="0" w:evenVBand="0" w:oddHBand="0" w:evenHBand="0" w:firstRowFirstColumn="0" w:firstRowLastColumn="0" w:lastRowFirstColumn="0" w:lastRowLastColumn="0"/>
-            <w:tcW w:w="715" w:type="dxa"/>
+            <w:tcW w:w="810" w:type="dxa"/>
             <w:hideMark/>
           </w:tcPr>
           <w:p>
@@ -784,7 +866,7 @@
         </w:tc>
         <w:tc>
           <w:tcPr>
-            <w:tcW w:w="1710" w:type="dxa"/>
+            <w:tcW w:w="1890" w:type="dxa"/>
             <w:hideMark/>
           </w:tcPr>
           <w:p>
@@ -817,7 +899,7 @@
         </w:tc>
         <w:tc>
           <w:tcPr>
-            <w:tcW w:w="2520" w:type="dxa"/>
+            <w:tcW w:w="2790" w:type="dxa"/>
             <w:hideMark/>
           </w:tcPr>
           <w:p>
@@ -830,7 +912,7 @@
                 <w:szCs w:val="22"/>
               </w:rPr>
             </w:pPr>
-            <w:hyperlink r:id="rId13" w:history="1">
+            <w:hyperlink r:id="rId16" w:history="1">
               <w:r>
                 <w:rPr>
                   <w:rStyle w:val="Hyperlink"/>
@@ -851,7 +933,7 @@
         <w:tc>
           <w:tcPr>
             <w:cnfStyle w:val="001000000000" w:firstRow="0" w:lastRow="0" w:firstColumn="1" w:lastColumn="0" w:oddVBand="0" w:evenVBand="0" w:oddHBand="0" w:evenHBand="0" w:firstRowFirstColumn="0" w:firstRowLastColumn="0" w:lastRowFirstColumn="0" w:lastRowLastColumn="0"/>
-            <w:tcW w:w="715" w:type="dxa"/>
+            <w:tcW w:w="810" w:type="dxa"/>
             <w:hideMark/>
           </w:tcPr>
           <w:p>
@@ -869,6 +951,7 @@
                 <w:sz w:val="22"/>
                 <w:szCs w:val="22"/>
               </w:rPr>
+              <w:lastRenderedPageBreak/>
               <w:t>3</w:t>
             </w:r>
           </w:p>
@@ -901,7 +984,7 @@
         </w:tc>
         <w:tc>
           <w:tcPr>
-            <w:tcW w:w="1710" w:type="dxa"/>
+            <w:tcW w:w="1890" w:type="dxa"/>
             <w:hideMark/>
           </w:tcPr>
           <w:p>
@@ -934,7 +1017,7 @@
         </w:tc>
         <w:tc>
           <w:tcPr>
-            <w:tcW w:w="2520" w:type="dxa"/>
+            <w:tcW w:w="2790" w:type="dxa"/>
             <w:hideMark/>
           </w:tcPr>
           <w:p>
@@ -947,7 +1030,7 @@
                 <w:szCs w:val="22"/>
               </w:rPr>
             </w:pPr>
-            <w:hyperlink r:id="rId14" w:history="1">
+            <w:hyperlink r:id="rId17" w:history="1">
               <w:r>
                 <w:rPr>
                   <w:rStyle w:val="Hyperlink"/>
@@ -961,7 +1044,7 @@
           </w:p>
           <w:p>
             <w:pPr>
-              <w:spacing w:after="160" w:line="278" w:lineRule="auto"/>
+              <w:spacing w:after="160"/>
               <w:cnfStyle w:val="000000100000" w:firstRow="0" w:lastRow="0" w:firstColumn="0" w:lastColumn="0" w:oddVBand="0" w:evenVBand="0" w:oddHBand="1" w:evenHBand="0" w:firstRowFirstColumn="0" w:firstRowLastColumn="0" w:lastRowFirstColumn="0" w:lastRowLastColumn="0"/>
               <w:rPr>
                 <w:rFonts w:ascii="Segoe UI" w:hAnsi="Segoe UI" w:cs="Segoe UI"/>
@@ -975,10 +1058,34 @@
                 <w:sz w:val="22"/>
                 <w:szCs w:val="22"/>
               </w:rPr>
-              <w:lastRenderedPageBreak/>
-              <w:t xml:space="preserve">Commit - </w:t>
-            </w:r>
-            <w:hyperlink r:id="rId15" w:history="1">
+              <w:t>Commit</w:t>
+            </w:r>
+            <w:r>
+              <w:rPr>
+                <w:rFonts w:ascii="Segoe UI" w:hAnsi="Segoe UI" w:cs="Segoe UI"/>
+                <w:sz w:val="22"/>
+                <w:szCs w:val="22"/>
+              </w:rPr>
+              <w:t>:</w:t>
+            </w:r>
+            <w:r>
+              <w:rPr>
+                <w:rFonts w:ascii="Segoe UI" w:hAnsi="Segoe UI" w:cs="Segoe UI"/>
+                <w:sz w:val="22"/>
+                <w:szCs w:val="22"/>
+              </w:rPr>
+              <w:t xml:space="preserve"> </w:t>
+            </w:r>
+            <w:hyperlink r:id="rId18" w:history="1">
+              <w:r>
+                <w:rPr>
+                  <w:rStyle w:val="Hyperlink"/>
+                  <w:rFonts w:asciiTheme="majorHAnsi" w:hAnsiTheme="majorHAnsi" w:cs="Segoe UI"/>
+                  <w:sz w:val="22"/>
+                  <w:szCs w:val="22"/>
+                </w:rPr>
+                <w:t>code</w:t>
+              </w:r>
               <w:r>
                 <w:rPr>
                   <w:rStyle w:val="Hyperlink"/>
@@ -986,7 +1093,54 @@
                   <w:sz w:val="22"/>
                   <w:szCs w:val="22"/>
                 </w:rPr>
-                <w:t>code-fix-applied</w:t>
+                <w:t>-fix-applied</w:t>
+              </w:r>
+              <w:r>
+                <w:rPr>
+                  <w:rStyle w:val="Hyperlink"/>
+                </w:rPr>
+                <w:t xml:space="preserve"> </w:t>
+              </w:r>
+              <w:r>
+                <w:rPr>
+                  <w:rStyle w:val="Hyperlink"/>
+                  <w:b/>
+                  <w:bCs/>
+                  <w:sz w:val="22"/>
+                  <w:szCs w:val="22"/>
+                  <w:lang w:val="en-IN"/>
+                </w:rPr>
+                <w:t>26f6262</w:t>
+              </w:r>
+            </w:hyperlink>
+          </w:p>
+          <w:p>
+            <w:pPr>
+              <w:spacing w:after="160"/>
+              <w:cnfStyle w:val="000000100000" w:firstRow="0" w:lastRow="0" w:firstColumn="0" w:lastColumn="0" w:oddVBand="0" w:evenVBand="0" w:oddHBand="1" w:evenHBand="0" w:firstRowFirstColumn="0" w:firstRowLastColumn="0" w:lastRowFirstColumn="0" w:lastRowLastColumn="0"/>
+              <w:rPr>
+                <w:b/>
+                <w:bCs/>
+                <w:lang w:val="en-IN"/>
+              </w:rPr>
+            </w:pPr>
+            <w:r>
+              <w:rPr>
+                <w:rFonts w:ascii="Segoe UI" w:hAnsi="Segoe UI" w:cs="Segoe UI"/>
+                <w:sz w:val="22"/>
+                <w:szCs w:val="22"/>
+              </w:rPr>
+              <w:t xml:space="preserve">Build Logs: </w:t>
+            </w:r>
+            <w:hyperlink r:id="rId19" w:history="1">
+              <w:r>
+                <w:rPr>
+                  <w:rStyle w:val="Hyperlink"/>
+                  <w:rFonts w:ascii="Segoe UI" w:hAnsi="Segoe UI" w:cs="Segoe UI"/>
+                  <w:sz w:val="22"/>
+                  <w:szCs w:val="22"/>
+                </w:rPr>
+                <w:t>26f6262-code-fix-applied.txt</w:t>
               </w:r>
             </w:hyperlink>
           </w:p>
@@ -996,7 +1150,7 @@
         <w:tc>
           <w:tcPr>
             <w:cnfStyle w:val="001000000000" w:firstRow="0" w:lastRow="0" w:firstColumn="1" w:lastColumn="0" w:oddVBand="0" w:evenVBand="0" w:oddHBand="0" w:evenHBand="0" w:firstRowFirstColumn="0" w:firstRowLastColumn="0" w:lastRowFirstColumn="0" w:lastRowLastColumn="0"/>
-            <w:tcW w:w="715" w:type="dxa"/>
+            <w:tcW w:w="810" w:type="dxa"/>
             <w:hideMark/>
           </w:tcPr>
           <w:p>
@@ -1014,7 +1168,6 @@
                 <w:sz w:val="22"/>
                 <w:szCs w:val="22"/>
               </w:rPr>
-              <w:lastRenderedPageBreak/>
               <w:t>4</w:t>
             </w:r>
           </w:p>
@@ -1067,7 +1220,7 @@
         </w:tc>
         <w:tc>
           <w:tcPr>
-            <w:tcW w:w="1710" w:type="dxa"/>
+            <w:tcW w:w="1890" w:type="dxa"/>
             <w:hideMark/>
           </w:tcPr>
           <w:p>
@@ -1100,7 +1253,7 @@
         </w:tc>
         <w:tc>
           <w:tcPr>
-            <w:tcW w:w="2520" w:type="dxa"/>
+            <w:tcW w:w="2790" w:type="dxa"/>
             <w:hideMark/>
           </w:tcPr>
           <w:p>
@@ -1113,7 +1266,7 @@
                 <w:szCs w:val="22"/>
               </w:rPr>
             </w:pPr>
-            <w:hyperlink r:id="rId16" w:history="1">
+            <w:hyperlink r:id="rId20" w:history="1">
               <w:r>
                 <w:rPr>
                   <w:rStyle w:val="Hyperlink"/>
@@ -1135,7 +1288,7 @@
                 <w:szCs w:val="22"/>
               </w:rPr>
             </w:pPr>
-            <w:hyperlink r:id="rId17" w:history="1">
+            <w:hyperlink r:id="rId21" w:history="1">
               <w:r>
                 <w:rPr>
                   <w:rStyle w:val="Hyperlink"/>
@@ -1156,7 +1309,7 @@
         <w:tc>
           <w:tcPr>
             <w:cnfStyle w:val="001000000000" w:firstRow="0" w:lastRow="0" w:firstColumn="1" w:lastColumn="0" w:oddVBand="0" w:evenVBand="0" w:oddHBand="0" w:evenHBand="0" w:firstRowFirstColumn="0" w:firstRowLastColumn="0" w:lastRowFirstColumn="0" w:lastRowLastColumn="0"/>
-            <w:tcW w:w="715" w:type="dxa"/>
+            <w:tcW w:w="810" w:type="dxa"/>
           </w:tcPr>
           <w:p>
             <w:pPr>
@@ -1214,7 +1367,7 @@
         </w:tc>
         <w:tc>
           <w:tcPr>
-            <w:tcW w:w="1710" w:type="dxa"/>
+            <w:tcW w:w="1890" w:type="dxa"/>
           </w:tcPr>
           <w:p>
             <w:pPr>
@@ -1237,7 +1390,7 @@
         </w:tc>
         <w:tc>
           <w:tcPr>
-            <w:tcW w:w="2520" w:type="dxa"/>
+            <w:tcW w:w="2790" w:type="dxa"/>
           </w:tcPr>
           <w:p>
             <w:pPr>
@@ -1248,7 +1401,7 @@
                 <w:szCs w:val="22"/>
               </w:rPr>
             </w:pPr>
-            <w:hyperlink r:id="rId18" w:history="1">
+            <w:hyperlink r:id="rId22" w:history="1">
               <w:r>
                 <w:rPr>
                   <w:rStyle w:val="Hyperlink"/>
@@ -1266,7 +1419,7 @@
         <w:tc>
           <w:tcPr>
             <w:cnfStyle w:val="001000000000" w:firstRow="0" w:lastRow="0" w:firstColumn="1" w:lastColumn="0" w:oddVBand="0" w:evenVBand="0" w:oddHBand="0" w:evenHBand="0" w:firstRowFirstColumn="0" w:firstRowLastColumn="0" w:lastRowFirstColumn="0" w:lastRowLastColumn="0"/>
-            <w:tcW w:w="715" w:type="dxa"/>
+            <w:tcW w:w="810" w:type="dxa"/>
             <w:hideMark/>
           </w:tcPr>
           <w:p>
@@ -1375,7 +1528,7 @@
         </w:tc>
         <w:tc>
           <w:tcPr>
-            <w:tcW w:w="1710" w:type="dxa"/>
+            <w:tcW w:w="1890" w:type="dxa"/>
             <w:hideMark/>
           </w:tcPr>
           <w:p>
@@ -1408,7 +1561,7 @@
         </w:tc>
         <w:tc>
           <w:tcPr>
-            <w:tcW w:w="2520" w:type="dxa"/>
+            <w:tcW w:w="2790" w:type="dxa"/>
             <w:hideMark/>
           </w:tcPr>
           <w:p>
@@ -1421,7 +1574,7 @@
                 <w:szCs w:val="22"/>
               </w:rPr>
             </w:pPr>
-            <w:hyperlink r:id="rId19" w:history="1">
+            <w:hyperlink r:id="rId23" w:history="1">
               <w:r>
                 <w:rPr>
                   <w:rStyle w:val="Hyperlink"/>
@@ -1435,10 +1588,10 @@
           </w:p>
           <w:p>
             <w:pPr>
-              <w:spacing w:after="160" w:line="278" w:lineRule="auto"/>
+              <w:spacing w:after="160"/>
               <w:cnfStyle w:val="000000000000" w:firstRow="0" w:lastRow="0" w:firstColumn="0" w:lastColumn="0" w:oddVBand="0" w:evenVBand="0" w:oddHBand="0" w:evenHBand="0" w:firstRowFirstColumn="0" w:firstRowLastColumn="0" w:lastRowFirstColumn="0" w:lastRowLastColumn="0"/>
               <w:rPr>
-                <w:rFonts w:ascii="Segoe UI" w:hAnsi="Segoe UI" w:cs="Segoe UI"/>
+                <w:rFonts w:asciiTheme="majorHAnsi" w:hAnsiTheme="majorHAnsi" w:cs="Segoe UI"/>
                 <w:sz w:val="22"/>
                 <w:szCs w:val="22"/>
               </w:rPr>
@@ -1446,16 +1599,32 @@
             <w:r>
               <w:rPr>
                 <w:rFonts w:ascii="Segoe UI" w:hAnsi="Segoe UI" w:cs="Segoe UI"/>
-                <w:sz w:val="22"/>
-                <w:szCs w:val="22"/>
-              </w:rPr>
-              <w:t xml:space="preserve">Commit - </w:t>
-            </w:r>
-            <w:hyperlink r:id="rId20" w:history="1">
+                <w:sz w:val="20"/>
+                <w:szCs w:val="20"/>
+              </w:rPr>
+              <w:t>Commit</w:t>
+            </w:r>
+            <w:r>
+              <w:rPr>
+                <w:rFonts w:ascii="Segoe UI" w:hAnsi="Segoe UI" w:cs="Segoe UI"/>
+                <w:sz w:val="20"/>
+                <w:szCs w:val="20"/>
+              </w:rPr>
+              <w:t>:</w:t>
+            </w:r>
+            <w:r>
+              <w:rPr>
+                <w:rFonts w:ascii="Segoe UI" w:hAnsi="Segoe UI" w:cs="Segoe UI"/>
+                <w:sz w:val="22"/>
+                <w:szCs w:val="22"/>
+              </w:rPr>
+              <w:t xml:space="preserve"> </w:t>
+            </w:r>
+            <w:hyperlink r:id="rId24" w:history="1">
               <w:r>
                 <w:rPr>
                   <w:rStyle w:val="Hyperlink"/>
-                  <w:rFonts w:ascii="Segoe UI" w:hAnsi="Segoe UI" w:cs="Segoe UI"/>
+                  <w:rFonts w:asciiTheme="majorHAnsi" w:hAnsiTheme="majorHAnsi" w:cs="Segoe UI"/>
                   <w:sz w:val="22"/>
                   <w:szCs w:val="22"/>
                 </w:rPr>
@@ -1465,7 +1634,7 @@
               <w:r>
                 <w:rPr>
                   <w:rStyle w:val="Hyperlink"/>
-                  <w:rFonts w:ascii="Segoe UI" w:hAnsi="Segoe UI" w:cs="Segoe UI"/>
+                  <w:rFonts w:asciiTheme="majorHAnsi" w:hAnsiTheme="majorHAnsi" w:cs="Segoe UI"/>
                   <w:sz w:val="22"/>
                   <w:szCs w:val="22"/>
                 </w:rPr>
@@ -1475,11 +1644,65 @@
               <w:r>
                 <w:rPr>
                   <w:rStyle w:val="Hyperlink"/>
+                  <w:rFonts w:asciiTheme="majorHAnsi" w:hAnsiTheme="majorHAnsi" w:cs="Segoe UI"/>
+                  <w:sz w:val="22"/>
+                  <w:szCs w:val="22"/>
+                </w:rPr>
+                <w:t>-BL0012</w:t>
+              </w:r>
+              <w:r>
+                <w:rPr>
+                  <w:rStyle w:val="Hyperlink"/>
+                  <w:rFonts w:asciiTheme="majorHAnsi" w:hAnsiTheme="majorHAnsi" w:cs="Segoe UI"/>
+                  <w:sz w:val="22"/>
+                  <w:szCs w:val="22"/>
+                </w:rPr>
+                <w:t xml:space="preserve"> </w:t>
+              </w:r>
+              <w:r>
+                <w:rPr>
+                  <w:rStyle w:val="Hyperlink"/>
+                  <w:rFonts w:asciiTheme="majorHAnsi" w:hAnsiTheme="majorHAnsi" w:cs="Segoe UI"/>
+                  <w:b/>
+                  <w:bCs/>
+                  <w:sz w:val="22"/>
+                  <w:szCs w:val="22"/>
+                  <w:lang w:val="en-IN"/>
+                </w:rPr>
+                <w:t>14d3e37</w:t>
+              </w:r>
+            </w:hyperlink>
+          </w:p>
+          <w:p>
+            <w:pPr>
+              <w:spacing w:after="160"/>
+              <w:cnfStyle w:val="000000000000" w:firstRow="0" w:lastRow="0" w:firstColumn="0" w:lastColumn="0" w:oddVBand="0" w:evenVBand="0" w:oddHBand="0" w:evenHBand="0" w:firstRowFirstColumn="0" w:firstRowLastColumn="0" w:lastRowFirstColumn="0" w:lastRowLastColumn="0"/>
+              <w:rPr>
+                <w:rFonts w:ascii="Segoe UI" w:hAnsi="Segoe UI" w:cs="Segoe UI"/>
+                <w:b/>
+                <w:bCs/>
+                <w:sz w:val="22"/>
+                <w:szCs w:val="22"/>
+                <w:lang w:val="en-IN"/>
+              </w:rPr>
+            </w:pPr>
+            <w:r>
+              <w:rPr>
+                <w:rFonts w:ascii="Segoe UI" w:hAnsi="Segoe UI" w:cs="Segoe UI"/>
+                <w:sz w:val="22"/>
+                <w:szCs w:val="22"/>
+              </w:rPr>
+              <w:t xml:space="preserve">Build Logs: </w:t>
+            </w:r>
+            <w:hyperlink r:id="rId25" w:history="1">
+              <w:r>
+                <w:rPr>
+                  <w:rStyle w:val="Hyperlink"/>
                   <w:rFonts w:ascii="Segoe UI" w:hAnsi="Segoe UI" w:cs="Segoe UI"/>
                   <w:sz w:val="22"/>
                   <w:szCs w:val="22"/>
                 </w:rPr>
-                <w:t>-BL0012</w:t>
+                <w:t>14d3e37-after-final-await.txt</w:t>
               </w:r>
             </w:hyperlink>
           </w:p>
@@ -1492,7 +1715,7 @@
         <w:tc>
           <w:tcPr>
             <w:cnfStyle w:val="001000000000" w:firstRow="0" w:lastRow="0" w:firstColumn="1" w:lastColumn="0" w:oddVBand="0" w:evenVBand="0" w:oddHBand="0" w:evenHBand="0" w:firstRowFirstColumn="0" w:firstRowLastColumn="0" w:lastRowFirstColumn="0" w:lastRowLastColumn="0"/>
-            <w:tcW w:w="715" w:type="dxa"/>
+            <w:tcW w:w="810" w:type="dxa"/>
             <w:hideMark/>
           </w:tcPr>
           <w:p>
@@ -1573,7 +1796,7 @@
         </w:tc>
         <w:tc>
           <w:tcPr>
-            <w:tcW w:w="1710" w:type="dxa"/>
+            <w:tcW w:w="1890" w:type="dxa"/>
             <w:hideMark/>
           </w:tcPr>
           <w:p>
@@ -1606,20 +1829,20 @@
         </w:tc>
         <w:tc>
           <w:tcPr>
-            <w:tcW w:w="2520" w:type="dxa"/>
+            <w:tcW w:w="2790" w:type="dxa"/>
             <w:hideMark/>
           </w:tcPr>
           <w:p>
             <w:pPr>
-              <w:spacing w:after="160" w:line="278" w:lineRule="auto"/>
+              <w:spacing w:after="160"/>
               <w:cnfStyle w:val="000000100000" w:firstRow="0" w:lastRow="0" w:firstColumn="0" w:lastColumn="0" w:oddVBand="0" w:evenVBand="0" w:oddHBand="1" w:evenHBand="0" w:firstRowFirstColumn="0" w:firstRowLastColumn="0" w:lastRowFirstColumn="0" w:lastRowLastColumn="0"/>
               <w:rPr>
                 <w:rFonts w:ascii="Segoe UI" w:hAnsi="Segoe UI" w:cs="Segoe UI"/>
-                <w:sz w:val="22"/>
-                <w:szCs w:val="22"/>
+                <w:sz w:val="20"/>
+                <w:szCs w:val="20"/>
               </w:rPr>
             </w:pPr>
-            <w:hyperlink r:id="rId21" w:history="1">
+            <w:hyperlink r:id="rId26" w:history="1">
               <w:r>
                 <w:rPr>
                   <w:rStyle w:val="Hyperlink"/>
@@ -1630,6 +1853,218 @@
                 <w:t>7-Adding_await</w:t>
               </w:r>
             </w:hyperlink>
+            <w:r>
+              <w:br/>
+            </w:r>
+            <w:r>
+              <w:br/>
+            </w:r>
+            <w:r>
+              <w:rPr>
+                <w:rFonts w:ascii="Segoe UI" w:hAnsi="Segoe UI" w:cs="Segoe UI"/>
+                <w:sz w:val="20"/>
+                <w:szCs w:val="20"/>
+              </w:rPr>
+              <w:t>Not adding await</w:t>
+            </w:r>
+            <w:r>
+              <w:rPr>
+                <w:rFonts w:ascii="Segoe UI" w:hAnsi="Segoe UI" w:cs="Segoe UI"/>
+                <w:sz w:val="20"/>
+                <w:szCs w:val="20"/>
+              </w:rPr>
+              <w:t>:</w:t>
+            </w:r>
+            <w:r>
+              <w:rPr>
+                <w:rFonts w:ascii="Segoe UI" w:hAnsi="Segoe UI" w:cs="Segoe UI"/>
+                <w:sz w:val="20"/>
+                <w:szCs w:val="20"/>
+              </w:rPr>
+              <w:t xml:space="preserve"> </w:t>
+            </w:r>
+            <w:hyperlink r:id="rId27" w:history="1">
+              <w:r>
+                <w:rPr>
+                  <w:rStyle w:val="Hyperlink"/>
+                  <w:rFonts w:asciiTheme="majorHAnsi" w:hAnsiTheme="majorHAnsi" w:cs="Segoe UI"/>
+                  <w:sz w:val="22"/>
+                  <w:szCs w:val="22"/>
+                </w:rPr>
+                <w:t xml:space="preserve">reverting changes </w:t>
+              </w:r>
+              <w:r>
+                <w:rPr>
+                  <w:rStyle w:val="Hyperlink"/>
+                  <w:rFonts w:asciiTheme="majorHAnsi" w:hAnsiTheme="majorHAnsi" w:cs="Segoe UI"/>
+                  <w:b/>
+                  <w:bCs/>
+                  <w:sz w:val="22"/>
+                  <w:szCs w:val="22"/>
+                  <w:lang w:val="en-IN"/>
+                </w:rPr>
+                <w:t>52798de</w:t>
+              </w:r>
+            </w:hyperlink>
+            <w:r>
+              <w:rPr>
+                <w:rFonts w:ascii="Segoe UI" w:hAnsi="Segoe UI" w:cs="Segoe UI"/>
+                <w:sz w:val="20"/>
+                <w:szCs w:val="20"/>
+              </w:rPr>
+              <w:t xml:space="preserve"> </w:t>
+            </w:r>
+          </w:p>
+          <w:p>
+            <w:pPr>
+              <w:spacing w:after="160"/>
+              <w:cnfStyle w:val="000000100000" w:firstRow="0" w:lastRow="0" w:firstColumn="0" w:lastColumn="0" w:oddVBand="0" w:evenVBand="0" w:oddHBand="1" w:evenHBand="0" w:firstRowFirstColumn="0" w:firstRowLastColumn="0" w:lastRowFirstColumn="0" w:lastRowLastColumn="0"/>
+              <w:rPr>
+                <w:rFonts w:ascii="Segoe UI" w:hAnsi="Segoe UI" w:cs="Segoe UI"/>
+                <w:sz w:val="20"/>
+                <w:szCs w:val="20"/>
+              </w:rPr>
+            </w:pPr>
+            <w:r>
+              <w:rPr>
+                <w:rFonts w:ascii="Segoe UI" w:hAnsi="Segoe UI" w:cs="Segoe UI"/>
+                <w:sz w:val="20"/>
+                <w:szCs w:val="20"/>
+              </w:rPr>
+              <w:t xml:space="preserve">Build Logs: </w:t>
+            </w:r>
+            <w:hyperlink r:id="rId28" w:history="1">
+              <w:r>
+                <w:rPr>
+                  <w:rStyle w:val="Hyperlink"/>
+                  <w:rFonts w:ascii="Segoe UI" w:hAnsi="Segoe UI" w:cs="Segoe UI"/>
+                  <w:sz w:val="20"/>
+                  <w:szCs w:val="20"/>
+                </w:rPr>
+                <w:t>52798de-four-warning-main.txt</w:t>
+              </w:r>
+            </w:hyperlink>
+          </w:p>
+          <w:p>
+            <w:pPr>
+              <w:spacing w:after="160"/>
+              <w:cnfStyle w:val="000000100000" w:firstRow="0" w:lastRow="0" w:firstColumn="0" w:lastColumn="0" w:oddVBand="0" w:evenVBand="0" w:oddHBand="1" w:evenHBand="0" w:firstRowFirstColumn="0" w:firstRowLastColumn="0" w:lastRowFirstColumn="0" w:lastRowLastColumn="0"/>
+              <w:rPr>
+                <w:rFonts w:ascii="Segoe UI" w:hAnsi="Segoe UI" w:cs="Segoe UI"/>
+                <w:b/>
+                <w:bCs/>
+                <w:sz w:val="20"/>
+                <w:szCs w:val="20"/>
+                <w:lang w:val="en-IN"/>
+              </w:rPr>
+            </w:pPr>
+          </w:p>
+          <w:p>
+            <w:pPr>
+              <w:spacing w:after="160"/>
+              <w:cnfStyle w:val="000000100000" w:firstRow="0" w:lastRow="0" w:firstColumn="0" w:lastColumn="0" w:oddVBand="0" w:evenVBand="0" w:oddHBand="1" w:evenHBand="0" w:firstRowFirstColumn="0" w:firstRowLastColumn="0" w:lastRowFirstColumn="0" w:lastRowLastColumn="0"/>
+              <w:rPr>
+                <w:rFonts w:asciiTheme="majorHAnsi" w:hAnsiTheme="majorHAnsi" w:cs="Segoe UI"/>
+                <w:sz w:val="22"/>
+                <w:szCs w:val="22"/>
+              </w:rPr>
+            </w:pPr>
+            <w:r>
+              <w:rPr>
+                <w:rFonts w:ascii="Segoe UI" w:hAnsi="Segoe UI" w:cs="Segoe UI"/>
+                <w:sz w:val="20"/>
+                <w:szCs w:val="20"/>
+              </w:rPr>
+              <w:t>A</w:t>
+            </w:r>
+            <w:r>
+              <w:rPr>
+                <w:rFonts w:ascii="Segoe UI" w:hAnsi="Segoe UI" w:cs="Segoe UI"/>
+                <w:sz w:val="20"/>
+                <w:szCs w:val="20"/>
+              </w:rPr>
+              <w:t>dding</w:t>
+            </w:r>
+            <w:r>
+              <w:rPr>
+                <w:rFonts w:ascii="Segoe UI" w:hAnsi="Segoe UI" w:cs="Segoe UI"/>
+                <w:sz w:val="20"/>
+                <w:szCs w:val="20"/>
+              </w:rPr>
+              <w:t xml:space="preserve"> await after the call</w:t>
+            </w:r>
+            <w:r>
+              <w:rPr>
+                <w:rFonts w:ascii="Segoe UI" w:hAnsi="Segoe UI" w:cs="Segoe UI"/>
+                <w:sz w:val="20"/>
+                <w:szCs w:val="20"/>
+              </w:rPr>
+              <w:t>:</w:t>
+            </w:r>
+            <w:r>
+              <w:rPr>
+                <w:rFonts w:ascii="Segoe UI" w:hAnsi="Segoe UI" w:cs="Segoe UI"/>
+                <w:sz w:val="22"/>
+                <w:szCs w:val="22"/>
+              </w:rPr>
+              <w:t xml:space="preserve"> </w:t>
+            </w:r>
+            <w:hyperlink r:id="rId29" w:history="1">
+              <w:r>
+                <w:rPr>
+                  <w:rStyle w:val="Hyperlink"/>
+                  <w:rFonts w:asciiTheme="majorHAnsi" w:hAnsiTheme="majorHAnsi" w:cs="Segoe UI"/>
+                  <w:sz w:val="22"/>
+                  <w:szCs w:val="22"/>
+                </w:rPr>
+                <w:t xml:space="preserve">adding-second-await-removes-BL0012-warning </w:t>
+              </w:r>
+              <w:r>
+                <w:rPr>
+                  <w:rStyle w:val="Hyperlink"/>
+                  <w:rFonts w:asciiTheme="majorHAnsi" w:hAnsiTheme="majorHAnsi" w:cs="Segoe UI"/>
+                  <w:b/>
+                  <w:bCs/>
+                  <w:sz w:val="22"/>
+                  <w:szCs w:val="22"/>
+                  <w:lang w:val="en-IN"/>
+                </w:rPr>
+                <w:t>1a51e37</w:t>
+              </w:r>
+            </w:hyperlink>
+          </w:p>
+          <w:p>
+            <w:pPr>
+              <w:spacing w:after="160"/>
+              <w:cnfStyle w:val="000000100000" w:firstRow="0" w:lastRow="0" w:firstColumn="0" w:lastColumn="0" w:oddVBand="0" w:evenVBand="0" w:oddHBand="1" w:evenHBand="0" w:firstRowFirstColumn="0" w:firstRowLastColumn="0" w:lastRowFirstColumn="0" w:lastRowLastColumn="0"/>
+              <w:rPr>
+                <w:rFonts w:ascii="Segoe UI" w:hAnsi="Segoe UI" w:cs="Segoe UI"/>
+                <w:b/>
+                <w:bCs/>
+                <w:sz w:val="22"/>
+                <w:szCs w:val="22"/>
+                <w:lang w:val="en-IN"/>
+              </w:rPr>
+            </w:pPr>
+            <w:r>
+              <w:rPr>
+                <w:rFonts w:ascii="Segoe UI" w:hAnsi="Segoe UI" w:cs="Segoe UI"/>
+                <w:sz w:val="22"/>
+                <w:szCs w:val="22"/>
+              </w:rPr>
+              <w:t xml:space="preserve">Build Logs: </w:t>
+            </w:r>
+            <w:hyperlink r:id="rId30" w:history="1">
+              <w:r>
+                <w:rPr>
+                  <w:rStyle w:val="Hyperlink"/>
+                  <w:rFonts w:ascii="Segoe UI" w:hAnsi="Segoe UI" w:cs="Segoe UI"/>
+                  <w:sz w:val="22"/>
+                  <w:szCs w:val="22"/>
+                </w:rPr>
+                <w:t>1a51e37-second-await-removed.txt</w:t>
+              </w:r>
+            </w:hyperlink>
           </w:p>
         </w:tc>
       </w:tr>
@@ -1642,40 +2077,6 @@
           <w:szCs w:val="22"/>
         </w:rPr>
       </w:pPr>
-    </w:p>
-    <w:p>
-      <w:pPr>
-        <w:jc w:val="center"/>
-        <w:rPr>
-          <w:rFonts w:ascii="Segoe UI" w:hAnsi="Segoe UI" w:cs="Segoe UI"/>
-          <w:sz w:val="22"/>
-          <w:szCs w:val="22"/>
-        </w:rPr>
-      </w:pPr>
-      <w:r>
-        <w:rPr>
-          <w:rFonts w:ascii="Segoe UI" w:hAnsi="Segoe UI" w:cs="Segoe UI"/>
-          <w:sz w:val="22"/>
-          <w:szCs w:val="22"/>
-        </w:rPr>
-        <w:t>-----</w:t>
-      </w:r>
-      <w:r>
-        <w:rPr>
-          <w:rFonts w:ascii="Segoe UI" w:hAnsi="Segoe UI" w:cs="Segoe UI"/>
-          <w:sz w:val="22"/>
-          <w:szCs w:val="22"/>
-        </w:rPr>
-        <w:t>-----------------------------------------------------------------------------------------------</w:t>
-      </w:r>
-      <w:r>
-        <w:rPr>
-          <w:rFonts w:ascii="Segoe UI" w:hAnsi="Segoe UI" w:cs="Segoe UI"/>
-          <w:sz w:val="22"/>
-          <w:szCs w:val="22"/>
-        </w:rPr>
-        <w:t>------</w:t>
-      </w:r>
     </w:p>
     <w:sectPr>
       <w:pgSz w:w="12240" w:h="15840"/>
@@ -1685,6 +2086,56 @@
     </w:sectPr>
   </w:body>
 </w:document>
+</file>
+
+<file path=word/endnotes.xml><?xml version="1.0" encoding="utf-8"?>
+<w:endnotes xmlns:wpc="http://schemas.microsoft.com/office/word/2010/wordprocessingCanvas" xmlns:cx="http://schemas.microsoft.com/office/drawing/2014/chartex" xmlns:cx1="http://schemas.microsoft.com/office/drawing/2015/9/8/chartex" xmlns:cx2="http://schemas.microsoft.com/office/drawing/2015/10/21/chartex" xmlns:cx3="http://schemas.microsoft.com/office/drawing/2016/5/9/chartex" xmlns:cx4="http://schemas.microsoft.com/office/drawing/2016/5/10/chartex" xmlns:cx5="http://schemas.microsoft.com/office/drawing/2016/5/11/chartex" xmlns:cx6="http://schemas.microsoft.com/office/drawing/2016/5/12/chartex" xmlns:cx7="http://schemas.microsoft.com/office/drawing/2016/5/13/chartex" xmlns:cx8="http://schemas.microsoft.com/office/drawing/2016/5/14/chartex" xmlns:mc="http://schemas.openxmlformats.org/markup-compatibility/2006" xmlns:aink="http://schemas.microsoft.com/office/drawing/2016/ink" xmlns:am3d="http://schemas.microsoft.com/office/drawing/2017/model3d" xmlns:o="urn:schemas-microsoft-com:office:office" xmlns:oel="http://schemas.microsoft.com/office/2019/extlst" xmlns:r="http://schemas.openxmlformats.org/officeDocument/2006/relationships" xmlns:m="http://schemas.openxmlformats.org/officeDocument/2006/math" xmlns:v="urn:schemas-microsoft-com:vml" xmlns:wp14="http://schemas.microsoft.com/office/word/2010/wordprocessingDrawing" xmlns:wp="http://schemas.openxmlformats.org/drawingml/2006/wordprocessingDrawing" xmlns:w10="urn:schemas-microsoft-com:office:word" xmlns:w="http://schemas.openxmlformats.org/wordprocessingml/2006/main" xmlns:w14="http://schemas.microsoft.com/office/word/2010/wordml" xmlns:w15="http://schemas.microsoft.com/office/word/2012/wordml" xmlns:w16cei="http://schemas.microsoft.com/office/word/2026/wordml/cei" xmlns:w16cex="http://schemas.microsoft.com/office/word/2018/wordml/cex" xmlns:w16cid="http://schemas.microsoft.com/office/word/2016/wordml/cid" xmlns:w16="http://schemas.microsoft.com/office/word/2018/wordml" xmlns:w16du="http://schemas.microsoft.com/office/word/2023/wordml/word16du" xmlns:w16sdtdh="http://schemas.microsoft.com/office/word/2020/wordml/sdtdatahash" xmlns:w16sdtfl="http://schemas.microsoft.com/office/word/2024/wordml/sdtformatlock" xmlns:w16se="http://schemas.microsoft.com/office/word/2015/wordml/symex" xmlns:wpg="http://schemas.microsoft.com/office/word/2010/wordprocessingGroup" xmlns:wpi="http://schemas.microsoft.com/office/word/2010/wordprocessingInk" xmlns:wne="http://schemas.microsoft.com/office/word/2006/wordml" xmlns:wps="http://schemas.microsoft.com/office/word/2010/wordprocessingShape" mc:Ignorable="w14 w15 w16se w16cid w16 w16cex w16sdtdh w16sdtfl w16du wp14">
+  <w:endnote w:type="separator" w:id="-1">
+    <w:p>
+      <w:pPr>
+        <w:spacing w:after="0" w:line="240" w:lineRule="auto"/>
+      </w:pPr>
+      <w:r>
+        <w:separator/>
+      </w:r>
+    </w:p>
+  </w:endnote>
+  <w:endnote w:type="continuationSeparator" w:id="0">
+    <w:p>
+      <w:pPr>
+        <w:spacing w:after="0" w:line="240" w:lineRule="auto"/>
+      </w:pPr>
+      <w:r>
+        <w:continuationSeparator/>
+      </w:r>
+    </w:p>
+  </w:endnote>
+</w:endnotes>
+</file>
+
+<file path=word/footnotes.xml><?xml version="1.0" encoding="utf-8"?>
+<w:footnotes xmlns:wpc="http://schemas.microsoft.com/office/word/2010/wordprocessingCanvas" xmlns:cx="http://schemas.microsoft.com/office/drawing/2014/chartex" xmlns:cx1="http://schemas.microsoft.com/office/drawing/2015/9/8/chartex" xmlns:cx2="http://schemas.microsoft.com/office/drawing/2015/10/21/chartex" xmlns:cx3="http://schemas.microsoft.com/office/drawing/2016/5/9/chartex" xmlns:cx4="http://schemas.microsoft.com/office/drawing/2016/5/10/chartex" xmlns:cx5="http://schemas.microsoft.com/office/drawing/2016/5/11/chartex" xmlns:cx6="http://schemas.microsoft.com/office/drawing/2016/5/12/chartex" xmlns:cx7="http://schemas.microsoft.com/office/drawing/2016/5/13/chartex" xmlns:cx8="http://schemas.microsoft.com/office/drawing/2016/5/14/chartex" xmlns:mc="http://schemas.openxmlformats.org/markup-compatibility/2006" xmlns:aink="http://schemas.microsoft.com/office/drawing/2016/ink" xmlns:am3d="http://schemas.microsoft.com/office/drawing/2017/model3d" xmlns:o="urn:schemas-microsoft-com:office:office" xmlns:oel="http://schemas.microsoft.com/office/2019/extlst" xmlns:r="http://schemas.openxmlformats.org/officeDocument/2006/relationships" xmlns:m="http://schemas.openxmlformats.org/officeDocument/2006/math" xmlns:v="urn:schemas-microsoft-com:vml" xmlns:wp14="http://schemas.microsoft.com/office/word/2010/wordprocessingDrawing" xmlns:wp="http://schemas.openxmlformats.org/drawingml/2006/wordprocessingDrawing" xmlns:w10="urn:schemas-microsoft-com:office:word" xmlns:w="http://schemas.openxmlformats.org/wordprocessingml/2006/main" xmlns:w14="http://schemas.microsoft.com/office/word/2010/wordml" xmlns:w15="http://schemas.microsoft.com/office/word/2012/wordml" xmlns:w16cei="http://schemas.microsoft.com/office/word/2026/wordml/cei" xmlns:w16cex="http://schemas.microsoft.com/office/word/2018/wordml/cex" xmlns:w16cid="http://schemas.microsoft.com/office/word/2016/wordml/cid" xmlns:w16="http://schemas.microsoft.com/office/word/2018/wordml" xmlns:w16du="http://schemas.microsoft.com/office/word/2023/wordml/word16du" xmlns:w16sdtdh="http://schemas.microsoft.com/office/word/2020/wordml/sdtdatahash" xmlns:w16sdtfl="http://schemas.microsoft.com/office/word/2024/wordml/sdtformatlock" xmlns:w16se="http://schemas.microsoft.com/office/word/2015/wordml/symex" xmlns:wpg="http://schemas.microsoft.com/office/word/2010/wordprocessingGroup" xmlns:wpi="http://schemas.microsoft.com/office/word/2010/wordprocessingInk" xmlns:wne="http://schemas.microsoft.com/office/word/2006/wordml" xmlns:wps="http://schemas.microsoft.com/office/word/2010/wordprocessingShape" mc:Ignorable="w14 w15 w16se w16cid w16 w16cex w16sdtdh w16sdtfl w16du wp14">
+  <w:footnote w:type="separator" w:id="-1">
+    <w:p>
+      <w:pPr>
+        <w:spacing w:after="0" w:line="240" w:lineRule="auto"/>
+      </w:pPr>
+      <w:r>
+        <w:separator/>
+      </w:r>
+    </w:p>
+  </w:footnote>
+  <w:footnote w:type="continuationSeparator" w:id="0">
+    <w:p>
+      <w:pPr>
+        <w:spacing w:after="0" w:line="240" w:lineRule="auto"/>
+      </w:pPr>
+      <w:r>
+        <w:continuationSeparator/>
+      </w:r>
+    </w:p>
+  </w:footnote>
+</w:footnotes>
 </file>
 
 <file path=word/numbering.xml><?xml version="1.0" encoding="utf-8"?>
@@ -4422,6 +4873,62 @@
       </w:tcPr>
     </w:tblStylePr>
   </w:style>
+  <w:style w:type="character" w:styleId="FollowedHyperlink">
+    <w:name w:val="FollowedHyperlink"/>
+    <w:basedOn w:val="DefaultParagraphFont"/>
+    <w:uiPriority w:val="99"/>
+    <w:semiHidden/>
+    <w:unhideWhenUsed/>
+    <w:rsid w:val="00323307"/>
+    <w:rPr>
+      <w:color w:val="96607D" w:themeColor="followedHyperlink"/>
+      <w:u w:val="single"/>
+    </w:rPr>
+  </w:style>
+  <w:style w:type="paragraph" w:styleId="Header">
+    <w:name w:val="header"/>
+    <w:basedOn w:val="Normal"/>
+    <w:link w:val="HeaderChar"/>
+    <w:uiPriority w:val="99"/>
+    <w:unhideWhenUsed/>
+    <w:rsid w:val="00B92744"/>
+    <w:pPr>
+      <w:tabs>
+        <w:tab w:val="center" w:pos="4513"/>
+        <w:tab w:val="right" w:pos="9026"/>
+      </w:tabs>
+      <w:spacing w:after="0" w:line="240" w:lineRule="auto"/>
+    </w:pPr>
+  </w:style>
+  <w:style w:type="character" w:customStyle="1" w:styleId="HeaderChar">
+    <w:name w:val="Header Char"/>
+    <w:basedOn w:val="DefaultParagraphFont"/>
+    <w:link w:val="Header"/>
+    <w:uiPriority w:val="99"/>
+    <w:rsid w:val="00B92744"/>
+  </w:style>
+  <w:style w:type="paragraph" w:styleId="Footer">
+    <w:name w:val="footer"/>
+    <w:basedOn w:val="Normal"/>
+    <w:link w:val="FooterChar"/>
+    <w:uiPriority w:val="99"/>
+    <w:unhideWhenUsed/>
+    <w:rsid w:val="00B92744"/>
+    <w:pPr>
+      <w:tabs>
+        <w:tab w:val="center" w:pos="4513"/>
+        <w:tab w:val="right" w:pos="9026"/>
+      </w:tabs>
+      <w:spacing w:after="0" w:line="240" w:lineRule="auto"/>
+    </w:pPr>
+  </w:style>
+  <w:style w:type="character" w:customStyle="1" w:styleId="FooterChar">
+    <w:name w:val="Footer Char"/>
+    <w:basedOn w:val="DefaultParagraphFont"/>
+    <w:link w:val="Footer"/>
+    <w:uiPriority w:val="99"/>
+    <w:rsid w:val="00B92744"/>
+  </w:style>
 </w:styles>
 </file>
 
@@ -4741,10 +5248,19 @@
 </file>
 
 <file path=customXml/item1.xml><?xml version="1.0" encoding="utf-8"?>
+<?mso-contentType ?>
+<FormTemplates xmlns="http://schemas.microsoft.com/sharepoint/v3/contenttype/forms">
+  <Display>DocumentLibraryForm</Display>
+  <Edit>DocumentLibraryForm</Edit>
+  <New>DocumentLibraryForm</New>
+</FormTemplates>
+</file>
+
+<file path=customXml/item2.xml><?xml version="1.0" encoding="utf-8"?>
 <b:Sources xmlns:b="http://schemas.openxmlformats.org/officeDocument/2006/bibliography" xmlns="http://schemas.openxmlformats.org/officeDocument/2006/bibliography" SelectedStyle="\APASixthEditionOfficeOnline.xsl" StyleName="APA" Version="6"/>
 </file>
 
-<file path=customXml/item2.xml><?xml version="1.0" encoding="utf-8"?>
+<file path=customXml/item3.xml><?xml version="1.0" encoding="utf-8"?>
 <ct:contentTypeSchema xmlns:ct="http://schemas.microsoft.com/office/2006/metadata/contentType" xmlns:ma="http://schemas.microsoft.com/office/2006/metadata/properties/metaAttributes" ct:_="" ma:_="" ma:contentTypeName="Document" ma:contentTypeID="0x0101002A361625FF487C4CA3EA5191E57B8C6D" ma:contentTypeVersion="7" ma:contentTypeDescription="Create a new document." ma:contentTypeScope="" ma:versionID="0eb70986208f3b9782e223574112875e">
   <xsd:schema xmlns:xsd="http://www.w3.org/2001/XMLSchema" xmlns:xs="http://www.w3.org/2001/XMLSchema" xmlns:p="http://schemas.microsoft.com/office/2006/metadata/properties" xmlns:ns2="caee7eb6-6dd4-45c1-9e8a-babddf390f35" targetNamespace="http://schemas.microsoft.com/office/2006/metadata/properties" ma:root="true" ma:fieldsID="c0a23b2e9e369a39959eaa3f9d93fb8c" ns2:_="">
     <xsd:import namespace="caee7eb6-6dd4-45c1-9e8a-babddf390f35"/>
@@ -4906,22 +5422,21 @@
 </ct:contentTypeSchema>
 </file>
 
-<file path=customXml/item3.xml><?xml version="1.0" encoding="utf-8"?>
+<file path=customXml/item4.xml><?xml version="1.0" encoding="utf-8"?>
 <p:properties xmlns:p="http://schemas.microsoft.com/office/2006/metadata/properties" xmlns:xsi="http://www.w3.org/2001/XMLSchema-instance" xmlns:pc="http://schemas.microsoft.com/office/infopath/2007/PartnerControls">
   <documentManagement/>
 </p:properties>
 </file>
 
-<file path=customXml/item4.xml><?xml version="1.0" encoding="utf-8"?>
-<?mso-contentType ?>
-<FormTemplates xmlns="http://schemas.microsoft.com/sharepoint/v3/contenttype/forms">
-  <Display>DocumentLibraryForm</Display>
-  <Edit>DocumentLibraryForm</Edit>
-  <New>DocumentLibraryForm</New>
-</FormTemplates>
+<file path=customXml/itemProps1.xml><?xml version="1.0" encoding="utf-8"?>
+<ds:datastoreItem xmlns:ds="http://schemas.openxmlformats.org/officeDocument/2006/customXml" ds:itemID="{3F631790-D3F3-4E18-B711-06B94DCBA81C}">
+  <ds:schemaRefs>
+    <ds:schemaRef ds:uri="http://schemas.microsoft.com/sharepoint/v3/contenttype/forms"/>
+  </ds:schemaRefs>
+</ds:datastoreItem>
 </file>
 
-<file path=customXml/itemProps1.xml><?xml version="1.0" encoding="utf-8"?>
+<file path=customXml/itemProps2.xml><?xml version="1.0" encoding="utf-8"?>
 <ds:datastoreItem xmlns:ds="http://schemas.openxmlformats.org/officeDocument/2006/customXml" ds:itemID="{5AAC773B-6D45-4B55-959C-3E5686415B21}">
   <ds:schemaRefs>
     <ds:schemaRef ds:uri="http://schemas.openxmlformats.org/officeDocument/2006/bibliography"/>
@@ -4929,7 +5444,7 @@
 </ds:datastoreItem>
 </file>
 
-<file path=customXml/itemProps2.xml><?xml version="1.0" encoding="utf-8"?>
+<file path=customXml/itemProps3.xml><?xml version="1.0" encoding="utf-8"?>
 <ds:datastoreItem xmlns:ds="http://schemas.openxmlformats.org/officeDocument/2006/customXml" ds:itemID="{E3968AD7-1EAE-4527-A6B8-19B4121ADDD4}">
   <ds:schemaRefs>
     <ds:schemaRef ds:uri="http://schemas.microsoft.com/office/2006/metadata/contentType"/>
@@ -4947,19 +5462,11 @@
 </ds:datastoreItem>
 </file>
 
-<file path=customXml/itemProps3.xml><?xml version="1.0" encoding="utf-8"?>
+<file path=customXml/itemProps4.xml><?xml version="1.0" encoding="utf-8"?>
 <ds:datastoreItem xmlns:ds="http://schemas.openxmlformats.org/officeDocument/2006/customXml" ds:itemID="{81546901-06A0-43C6-9CC9-9364E0B77FA2}">
   <ds:schemaRefs>
     <ds:schemaRef ds:uri="http://schemas.microsoft.com/office/2006/metadata/properties"/>
     <ds:schemaRef ds:uri="http://schemas.microsoft.com/office/infopath/2007/PartnerControls"/>
   </ds:schemaRefs>
 </ds:datastoreItem>
-</file>
-
-<file path=customXml/itemProps4.xml><?xml version="1.0" encoding="utf-8"?>
-<ds:datastoreItem xmlns:ds="http://schemas.openxmlformats.org/officeDocument/2006/customXml" ds:itemID="{3F631790-D3F3-4E18-B711-06B94DCBA81C}">
-  <ds:schemaRefs>
-    <ds:schemaRef ds:uri="http://schemas.microsoft.com/sharepoint/v3/contenttype/forms"/>
-  </ds:schemaRefs>
-</ds:datastoreItem>
 </file>
</xml_diff>